<commit_message>
docs(mjdrdypu): document Table 1 relabel in response-to-reviewers (item 15)
Add self-audit item 15 to the point-by-point reply recording the Table 1
intervention-class relabel ("Supplements" -> "Dietary supplements";
"Controversial" -> "Plasma/telomerase"), the new Table 1 defining Note,
the matching figure labels, and the supplementary bridging note — so the
reply matches the revised manuscript. Reply self-audit item 10 (Figure 1
text-overflow fix) is now accurate following the figure regeneration.

Co-Authored-By: Claude Opus 4.8 <noreply@anthropic.com>
</commit_message>
<xml_diff>
--- a/anti_ageing_review/submission_assets/MJDRDYPU_AntiAgeing_revision_R1_2026-06-23/MJDRDYPU_AntiAgeing_response_to_reviewers_R1_2026-06-23.docx
+++ b/anti_ageing_review/submission_assets/MJDRDYPU_AntiAgeing_revision_R1_2026-06-23/MJDRDYPU_AntiAgeing_response_to_reviewers_R1_2026-06-23.docx
@@ -1278,6 +1278,100 @@
             </w:pPr>
             <w:r>
               <w:t xml:space="preserve">Revised throughout for formal academic register, grammar, and clarity.</w:t>
+            </w:r>
+          </w:p>
+        </w:tc>
+      </w:tr>
+      <w:tr>
+        <w:tc>
+          <w:tcPr/>
+          <w:p>
+            <w:pPr>
+              <w:pStyle w:val="Compact"/>
+            </w:pPr>
+            <w:r>
+              <w:t xml:space="preserve">15</w:t>
+            </w:r>
+          </w:p>
+        </w:tc>
+        <w:tc>
+          <w:tcPr/>
+          <w:p>
+            <w:pPr>
+              <w:pStyle w:val="Compact"/>
+            </w:pPr>
+            <w:r>
+              <w:t xml:space="preserve">Table 1 intervention-class labels</w:t>
+            </w:r>
+          </w:p>
+        </w:tc>
+        <w:tc>
+          <w:tcPr/>
+          <w:p>
+            <w:pPr>
+              <w:pStyle w:val="Compact"/>
+            </w:pPr>
+            <w:r>
+              <w:t xml:space="preserve">Two grouped-category labels —</w:t>
+            </w:r>
+            <w:r>
+              <w:t xml:space="preserve"> </w:t>
+            </w:r>
+            <w:r>
+              <w:t xml:space="preserve">“Supplements”</w:t>
+            </w:r>
+            <w:r>
+              <w:t xml:space="preserve"> </w:t>
+            </w:r>
+            <w:r>
+              <w:t xml:space="preserve">and</w:t>
+            </w:r>
+            <w:r>
+              <w:t xml:space="preserve"> </w:t>
+            </w:r>
+            <w:r>
+              <w:t xml:space="preserve">“Controversial”</w:t>
+            </w:r>
+            <w:r>
+              <w:t xml:space="preserve"> </w:t>
+            </w:r>
+            <w:r>
+              <w:t xml:space="preserve">— were opaque without a definition.</w:t>
+            </w:r>
+          </w:p>
+        </w:tc>
+        <w:tc>
+          <w:tcPr/>
+          <w:p>
+            <w:pPr>
+              <w:pStyle w:val="Compact"/>
+            </w:pPr>
+            <w:r>
+              <w:t xml:space="preserve">Relabelled for clarity as</w:t>
+            </w:r>
+            <w:r>
+              <w:t xml:space="preserve"> </w:t>
+            </w:r>
+            <w:r>
+              <w:t xml:space="preserve">“Dietary supplements”</w:t>
+            </w:r>
+            <w:r>
+              <w:t xml:space="preserve"> </w:t>
+            </w:r>
+            <w:r>
+              <w:t xml:space="preserve">(resveratrol, curcumin, omega-3, vitamin D) and</w:t>
+            </w:r>
+            <w:r>
+              <w:t xml:space="preserve"> </w:t>
+            </w:r>
+            <w:r>
+              <w:t xml:space="preserve">“Plasma/telomerase”</w:t>
+            </w:r>
+            <w:r>
+              <w:t xml:space="preserve"> </w:t>
+            </w:r>
+            <w:r>
+              <w:t xml:space="preserve">(heterochronic parabiosis, young-plasma transfer, plasma dilution, telomerase activation); a defining Note was added beneath Table 1, the same labels were propagated to Figures 2–4, and a bridging note was added in the supplementary tables. (Table 1; Figures 2–4; Supplementary.)</w:t>
             </w:r>
           </w:p>
         </w:tc>

</xml_diff>